<commit_message>
Update Yu-Ting Chen's email address
</commit_message>
<xml_diff>
--- a/docs/research/paper1_vibe_coding_pedagogy.docx
+++ b/docs/research/paper1_vibe_coding_pedagogy.docx
@@ -211,6 +211,12 @@
           <w:rFonts w:hint="eastAsia"/>
         </w:rPr>
         <w:t xml:space="preserve">朝陽科技大學幼兒保育系</w:t>
+      </w:r>
+      <w:r>
+        <w:t xml:space="preserve"> </w:t>
+      </w:r>
+      <w:r>
+        <w:t xml:space="preserve">abc100308@gmail.com</w:t>
       </w:r>
     </w:p>
     <w:p>

</xml_diff>

<commit_message>
Update Rui-Yu Lin's email and Paper 04 CMT status
</commit_message>
<xml_diff>
--- a/docs/research/paper1_vibe_coding_pedagogy.docx
+++ b/docs/research/paper1_vibe_coding_pedagogy.docx
@@ -169,19 +169,7 @@
         <w:t xml:space="preserve"> </w:t>
       </w:r>
       <w:r>
-        <w:rPr>
-          <w:rFonts w:hint="eastAsia"/>
-        </w:rPr>
-        <w:t xml:space="preserve">[請在此填寫林瑞昱的</w:t>
-      </w:r>
-      <w:r>
-        <w:t xml:space="preserve"> </w:t>
-      </w:r>
-      <w:r>
-        <w:rPr>
-          <w:rFonts w:hint="eastAsia"/>
-        </w:rPr>
-        <w:t xml:space="preserve">Email，例如：rylin@mail.shu.edu.tw]</w:t>
+        <w:t xml:space="preserve">linroy1202a@gmail.com</w:t>
       </w:r>
     </w:p>
     <w:p>

</xml_diff>